<commit_message>
reorder docs fase 1
</commit_message>
<xml_diff>
--- a/Docs/docx/Termo-de-Abertura-do-Projeto.docx
+++ b/Docs/docx/Termo-de-Abertura-do-Projeto.docx
@@ -660,8 +660,8 @@
           <w:rFonts w:hint="default" w:ascii="Calibri" w:hAnsi="Calibri" w:cs="Calibri"/>
         </w:rPr>
       </w:pPr>
-      <w:bookmarkStart w:id="0" w:name="_Toc383370456"/>
-      <w:bookmarkStart w:id="1" w:name="_Toc422808766"/>
+      <w:bookmarkStart w:id="0" w:name="_Toc422808766"/>
+      <w:bookmarkStart w:id="1" w:name="_Toc383370456"/>
       <w:r>
         <w:rPr>
           <w:rFonts w:hint="default" w:ascii="Calibri" w:hAnsi="Calibri" w:cs="Calibri"/>
@@ -1018,8 +1018,8 @@
           <w:rFonts w:hint="default" w:ascii="Calibri" w:hAnsi="Calibri" w:cs="Calibri"/>
         </w:rPr>
       </w:pPr>
-      <w:bookmarkStart w:id="2" w:name="_Toc422808767"/>
-      <w:bookmarkStart w:id="3" w:name="_Toc383370457"/>
+      <w:bookmarkStart w:id="2" w:name="_Toc383370457"/>
+      <w:bookmarkStart w:id="3" w:name="_Toc422808767"/>
       <w:r>
         <w:rPr>
           <w:rFonts w:hint="default" w:ascii="Calibri" w:hAnsi="Calibri" w:cs="Calibri"/>
@@ -1495,8 +1495,8 @@
           <w:rFonts w:hint="default" w:ascii="Calibri" w:hAnsi="Calibri" w:cs="Calibri"/>
         </w:rPr>
       </w:pPr>
-      <w:bookmarkStart w:id="4" w:name="_Toc383370458"/>
-      <w:bookmarkStart w:id="5" w:name="_Toc422808768"/>
+      <w:bookmarkStart w:id="4" w:name="_Toc422808768"/>
+      <w:bookmarkStart w:id="5" w:name="_Toc383370458"/>
       <w:r>
         <w:rPr>
           <w:rFonts w:hint="default" w:ascii="Calibri" w:hAnsi="Calibri" w:cs="Calibri"/>
@@ -2824,7 +2824,26 @@
           <w:sz w:val="20"/>
           <w:szCs w:val="20"/>
         </w:rPr>
-        <w:t xml:space="preserve"> O MVP entregue for validado academicamente pelo Prof. Dr. Nivaldo Carleto e pelos stakeholders representativos (usuários-piloto) em uma sessão de validação prática, demonstrando que a ferramenta resolve a dor da falta de integração nas simulações cambiais.</w:t>
+        <w:t xml:space="preserve"> O MVP entregue for validado academicamente pelo Prof. Dr. Nivaldo Carleto e pelos stakeholders representativos (usuários-piloto</w:t>
+      </w:r>
+      <w:r>
+        <w:rPr>
+          <w:rFonts w:hint="default" w:ascii="Calibri" w:hAnsi="Calibri" w:cs="Calibri"/>
+          <w:sz w:val="20"/>
+          <w:szCs w:val="20"/>
+          <w:lang w:val="pt-BR"/>
+        </w:rPr>
+        <w:t>*</w:t>
+      </w:r>
+      <w:bookmarkStart w:id="14" w:name="_GoBack"/>
+      <w:bookmarkEnd w:id="14"/>
+      <w:r>
+        <w:rPr>
+          <w:rFonts w:hint="default" w:ascii="Calibri" w:hAnsi="Calibri" w:cs="Calibri"/>
+          <w:sz w:val="20"/>
+          <w:szCs w:val="20"/>
+        </w:rPr>
+        <w:t>) em uma sessão de validação prática, demonstrando que a ferramenta resolve a dor da falta de integração nas simulações cambiais.</w:t>
       </w:r>
     </w:p>
     <w:p>
@@ -3892,6 +3911,12 @@
             <w:insideH w:val="none" w:color="auto" w:sz="0" w:space="0"/>
             <w:insideV w:val="none" w:color="auto" w:sz="0" w:space="0"/>
           </w:tblBorders>
+          <w:tblCellMar>
+            <w:top w:w="80" w:type="dxa"/>
+            <w:left w:w="160" w:type="dxa"/>
+            <w:bottom w:w="80" w:type="dxa"/>
+            <w:right w:w="160" w:type="dxa"/>
+          </w:tblCellMar>
         </w:tblPrEx>
         <w:trPr>
           <w:tblCellSpacing w:w="0" w:type="dxa"/>
@@ -4604,6 +4629,12 @@
             <w:insideH w:val="none" w:color="auto" w:sz="0" w:space="0"/>
             <w:insideV w:val="none" w:color="auto" w:sz="0" w:space="0"/>
           </w:tblBorders>
+          <w:tblCellMar>
+            <w:top w:w="80" w:type="dxa"/>
+            <w:left w:w="160" w:type="dxa"/>
+            <w:bottom w:w="80" w:type="dxa"/>
+            <w:right w:w="160" w:type="dxa"/>
+          </w:tblCellMar>
         </w:tblPrEx>
         <w:trPr>
           <w:tblCellSpacing w:w="0" w:type="dxa"/>
@@ -5239,6 +5270,12 @@
             <w:insideH w:val="none" w:color="auto" w:sz="0" w:space="0"/>
             <w:insideV w:val="none" w:color="auto" w:sz="0" w:space="0"/>
           </w:tblBorders>
+          <w:tblCellMar>
+            <w:top w:w="80" w:type="dxa"/>
+            <w:left w:w="160" w:type="dxa"/>
+            <w:bottom w:w="80" w:type="dxa"/>
+            <w:right w:w="160" w:type="dxa"/>
+          </w:tblCellMar>
         </w:tblPrEx>
         <w:trPr>
           <w:tblCellSpacing w:w="0" w:type="dxa"/>
@@ -5865,6 +5902,12 @@
             <w:insideH w:val="none" w:color="auto" w:sz="0" w:space="0"/>
             <w:insideV w:val="none" w:color="auto" w:sz="0" w:space="0"/>
           </w:tblBorders>
+          <w:tblCellMar>
+            <w:top w:w="80" w:type="dxa"/>
+            <w:left w:w="160" w:type="dxa"/>
+            <w:bottom w:w="80" w:type="dxa"/>
+            <w:right w:w="160" w:type="dxa"/>
+          </w:tblCellMar>
         </w:tblPrEx>
         <w:trPr>
           <w:tblCellSpacing w:w="0" w:type="dxa"/>
@@ -6471,6 +6514,12 @@
             <w:insideH w:val="none" w:color="auto" w:sz="0" w:space="0"/>
             <w:insideV w:val="none" w:color="auto" w:sz="0" w:space="0"/>
           </w:tblBorders>
+          <w:tblCellMar>
+            <w:top w:w="80" w:type="dxa"/>
+            <w:left w:w="160" w:type="dxa"/>
+            <w:bottom w:w="80" w:type="dxa"/>
+            <w:right w:w="160" w:type="dxa"/>
+          </w:tblCellMar>
         </w:tblPrEx>
         <w:trPr>
           <w:tblCellSpacing w:w="0" w:type="dxa"/>
@@ -7057,6 +7106,12 @@
             <w:insideH w:val="none" w:color="auto" w:sz="0" w:space="0"/>
             <w:insideV w:val="none" w:color="auto" w:sz="0" w:space="0"/>
           </w:tblBorders>
+          <w:tblCellMar>
+            <w:top w:w="80" w:type="dxa"/>
+            <w:left w:w="160" w:type="dxa"/>
+            <w:bottom w:w="80" w:type="dxa"/>
+            <w:right w:w="160" w:type="dxa"/>
+          </w:tblCellMar>
         </w:tblPrEx>
         <w:trPr>
           <w:tblCellSpacing w:w="0" w:type="dxa"/>
@@ -7685,6 +7740,12 @@
             <w:insideH w:val="none" w:color="auto" w:sz="0" w:space="0"/>
             <w:insideV w:val="none" w:color="auto" w:sz="0" w:space="0"/>
           </w:tblBorders>
+          <w:tblCellMar>
+            <w:top w:w="80" w:type="dxa"/>
+            <w:left w:w="160" w:type="dxa"/>
+            <w:bottom w:w="80" w:type="dxa"/>
+            <w:right w:w="160" w:type="dxa"/>
+          </w:tblCellMar>
         </w:tblPrEx>
         <w:trPr>
           <w:tblCellSpacing w:w="0" w:type="dxa"/>
@@ -8457,6 +8518,12 @@
             <w:insideH w:val="none" w:color="auto" w:sz="0" w:space="0"/>
             <w:insideV w:val="none" w:color="auto" w:sz="0" w:space="0"/>
           </w:tblBorders>
+          <w:tblCellMar>
+            <w:top w:w="80" w:type="dxa"/>
+            <w:left w:w="160" w:type="dxa"/>
+            <w:bottom w:w="80" w:type="dxa"/>
+            <w:right w:w="160" w:type="dxa"/>
+          </w:tblCellMar>
         </w:tblPrEx>
         <w:trPr>
           <w:tblCellSpacing w:w="0" w:type="dxa"/>
@@ -9260,6 +9327,12 @@
             <w:insideH w:val="none" w:color="auto" w:sz="0" w:space="0"/>
             <w:insideV w:val="none" w:color="auto" w:sz="0" w:space="0"/>
           </w:tblBorders>
+          <w:tblCellMar>
+            <w:top w:w="80" w:type="dxa"/>
+            <w:left w:w="160" w:type="dxa"/>
+            <w:bottom w:w="80" w:type="dxa"/>
+            <w:right w:w="160" w:type="dxa"/>
+          </w:tblCellMar>
         </w:tblPrEx>
         <w:trPr>
           <w:tblCellSpacing w:w="0" w:type="dxa"/>
@@ -10082,6 +10155,12 @@
             <w:insideH w:val="none" w:color="auto" w:sz="0" w:space="0"/>
             <w:insideV w:val="none" w:color="auto" w:sz="0" w:space="0"/>
           </w:tblBorders>
+          <w:tblCellMar>
+            <w:top w:w="80" w:type="dxa"/>
+            <w:left w:w="160" w:type="dxa"/>
+            <w:bottom w:w="80" w:type="dxa"/>
+            <w:right w:w="160" w:type="dxa"/>
+          </w:tblCellMar>
         </w:tblPrEx>
         <w:trPr>
           <w:tblCellSpacing w:w="0" w:type="dxa"/>
@@ -19143,7 +19222,7 @@
                 <w:sz w:val="18"/>
                 <w:szCs w:val="18"/>
               </w:rPr>
-              <w:t>Documentação submetida via GitHub e validada pelo Prof. Dr. Nivaldo Carletto sem achados críticos.</w:t>
+              <w:t>Documentação submetida via GitHub e validada pelo Prof. Dr. Nivaldo Carleto sem achados críticos.</w:t>
             </w:r>
           </w:p>
         </w:tc>
@@ -25881,8 +25960,6 @@
           <w:szCs w:val="20"/>
         </w:rPr>
       </w:pPr>
-      <w:bookmarkStart w:id="14" w:name="_GoBack"/>
-      <w:bookmarkEnd w:id="14"/>
     </w:p>
     <w:p>
       <w:pPr>
@@ -27570,7 +27647,7 @@
                 <w:sz w:val="18"/>
                 <w:szCs w:val="18"/>
               </w:rPr>
-              <w:t>: Implementar adapter pattern para permitir troca de provedor; manter cache local de cotações (Fase N5.2) como fallback; documentar provedor selecionado via ADR-002.</w:t>
+              <w:t>: Implementar adapter pattern para permitir troca de provedor; manter cache local de cotações (Fase N5.2) como fallback; documentar provedor selecionado em registro formal de arquitetura..</w:t>
             </w:r>
           </w:p>
         </w:tc>

</xml_diff>

<commit_message>
Definição e redação de AC1 - Integração
</commit_message>
<xml_diff>
--- a/Docs/docx/Termo-de-Abertura-do-Projeto.docx
+++ b/Docs/docx/Termo-de-Abertura-do-Projeto.docx
@@ -660,8 +660,8 @@
           <w:rFonts w:hint="default" w:ascii="Calibri" w:hAnsi="Calibri" w:cs="Calibri"/>
         </w:rPr>
       </w:pPr>
-      <w:bookmarkStart w:id="0" w:name="_Toc383370456"/>
-      <w:bookmarkStart w:id="1" w:name="_Toc422808766"/>
+      <w:bookmarkStart w:id="0" w:name="_Toc422808766"/>
+      <w:bookmarkStart w:id="1" w:name="_Toc383370456"/>
       <w:r>
         <w:rPr>
           <w:rFonts w:hint="default" w:ascii="Calibri" w:hAnsi="Calibri" w:cs="Calibri"/>
@@ -8874,42 +8874,17 @@
                 <w:rFonts w:hint="default" w:ascii="Calibri" w:hAnsi="Calibri" w:cs="Calibri"/>
                 <w:sz w:val="16"/>
                 <w:szCs w:val="16"/>
-              </w:rPr>
-              <w:t>1</w:t>
-            </w:r>
-            <w:r>
-              <w:rPr>
-                <w:rFonts w:hint="default" w:ascii="Calibri" w:hAnsi="Calibri" w:cs="Calibri"/>
-                <w:sz w:val="16"/>
-                <w:szCs w:val="16"/>
                 <w:lang w:val="pt-BR"/>
               </w:rPr>
-              <w:t>0</w:t>
-            </w:r>
-            <w:r>
-              <w:rPr>
-                <w:rFonts w:hint="default" w:ascii="Calibri" w:hAnsi="Calibri" w:cs="Calibri"/>
-                <w:sz w:val="16"/>
-                <w:szCs w:val="16"/>
-              </w:rPr>
-              <w:t>.</w:t>
-            </w:r>
-            <w:r>
-              <w:rPr>
-                <w:rFonts w:hint="default" w:ascii="Calibri" w:hAnsi="Calibri" w:cs="Calibri"/>
-                <w:sz w:val="16"/>
-                <w:szCs w:val="16"/>
-                <w:lang w:val="pt-BR"/>
-              </w:rPr>
-              <w:t>1</w:t>
-            </w:r>
-            <w:r>
-              <w:rPr>
-                <w:rFonts w:hint="default" w:ascii="Calibri" w:hAnsi="Calibri" w:cs="Calibri"/>
-                <w:sz w:val="16"/>
-                <w:szCs w:val="16"/>
-              </w:rPr>
-              <w:t>. Registro de Solicitações de Mudança</w:t>
+              <w:t xml:space="preserve">10.1. </w:t>
+            </w:r>
+            <w:r>
+              <w:rPr>
+                <w:rFonts w:hint="default" w:ascii="Calibri" w:hAnsi="Calibri" w:cs="Calibri"/>
+                <w:sz w:val="16"/>
+                <w:szCs w:val="16"/>
+              </w:rPr>
+              <w:t>Registro de Solicitações de Mudança</w:t>
             </w:r>
           </w:p>
         </w:tc>
@@ -9118,19 +9093,21 @@
           </w:p>
           <w:p>
             <w:pPr>
-              <w:jc w:val="both"/>
-              <w:rPr>
-                <w:rFonts w:hint="default" w:ascii="Calibri" w:hAnsi="Calibri" w:cs="Calibri"/>
-                <w:sz w:val="16"/>
-                <w:szCs w:val="16"/>
-              </w:rPr>
-            </w:pPr>
-            <w:r>
-              <w:rPr>
-                <w:rFonts w:hint="default" w:ascii="Calibri" w:hAnsi="Calibri" w:cs="Calibri"/>
-                <w:sz w:val="16"/>
-                <w:szCs w:val="16"/>
-                <w:highlight w:val="lightGray"/>
+              <w:rPr>
+                <w:rFonts w:hint="default" w:ascii="Calibri" w:hAnsi="Calibri" w:cs="Calibri"/>
+                <w:i/>
+                <w:iCs/>
+                <w:sz w:val="16"/>
+                <w:szCs w:val="16"/>
+              </w:rPr>
+            </w:pPr>
+            <w:r>
+              <w:rPr>
+                <w:rFonts w:hint="default" w:ascii="Calibri" w:hAnsi="Calibri" w:cs="Calibri"/>
+                <w:i/>
+                <w:iCs/>
+                <w:sz w:val="16"/>
+                <w:szCs w:val="16"/>
               </w:rPr>
               <w:t>change-request</w:t>
             </w:r>
@@ -13491,7 +13468,6 @@
                 <w:szCs w:val="16"/>
               </w:rPr>
             </w:pPr>
-            <w:bookmarkStart w:id="14" w:name="_GoBack"/>
             <w:r>
               <w:rPr>
                 <w:rFonts w:hint="default" w:ascii="Calibri" w:hAnsi="Calibri" w:cs="Calibri"/>
@@ -13578,7 +13554,6 @@
           </w:p>
         </w:tc>
       </w:tr>
-      <w:bookmarkEnd w:id="14"/>
       <w:tr>
         <w:tblPrEx>
           <w:tblBorders>
@@ -13770,6 +13745,7 @@
       <w:pPr>
         <w:pStyle w:val="3"/>
         <w:numPr>
+          <w:ilvl w:val="1"/>
           <w:numId w:val="0"/>
         </w:numPr>
         <w:bidi w:val="0"/>
@@ -13841,7 +13817,7 @@
           <w:rFonts w:hint="default" w:ascii="Calibri" w:hAnsi="Calibri" w:eastAsia="Times New Roman" w:cs="Calibri"/>
           <w:lang w:val="pt-BR" w:eastAsia="en-US"/>
         </w:rPr>
-        <w:t>Dia grama Principal (Visão Executiva)</w:t>
+        <w:t>Diagrama Principal (Visão Executiva)</w:t>
       </w:r>
     </w:p>
     <w:p>
@@ -13865,10 +13841,50 @@
       </w:pPr>
       <w:r>
         <w:rPr>
-          <w:rFonts w:hint="default" w:ascii="Calibri" w:hAnsi="Calibri" w:cs="Calibri"/>
-          <w:lang w:val="pt-BR" w:eastAsia="en-US"/>
-        </w:rPr>
-        <w:t xml:space="preserve"> </w:t>
+          <w:rFonts w:hint="default" w:ascii="Calibri" w:hAnsi="Calibri" w:eastAsia="SimSun" w:cs="Calibri"/>
+          <w:b/>
+          <w:bCs/>
+          <w:sz w:val="22"/>
+          <w:szCs w:val="22"/>
+          <w:lang w:val="pt-BR" w:eastAsia="en-US" w:bidi="ar-SA"/>
+        </w:rPr>
+        <w:drawing>
+          <wp:inline distT="0" distB="0" distL="114300" distR="114300">
+            <wp:extent cx="5393055" cy="2877185"/>
+            <wp:effectExtent l="0" t="0" r="17145" b="18415"/>
+            <wp:docPr id="2" name="Picture 2" descr="EAP_COGME_v3.0_Principal.drawio"/>
+            <wp:cNvGraphicFramePr>
+              <a:graphicFrameLocks xmlns:a="http://schemas.openxmlformats.org/drawingml/2006/main" noChangeAspect="1"/>
+            </wp:cNvGraphicFramePr>
+            <a:graphic xmlns:a="http://schemas.openxmlformats.org/drawingml/2006/main">
+              <a:graphicData uri="http://schemas.openxmlformats.org/drawingml/2006/picture">
+                <pic:pic xmlns:pic="http://schemas.openxmlformats.org/drawingml/2006/picture">
+                  <pic:nvPicPr>
+                    <pic:cNvPr id="2" name="Picture 2" descr="EAP_COGME_v3.0_Principal.drawio"/>
+                    <pic:cNvPicPr>
+                      <a:picLocks noChangeAspect="1"/>
+                    </pic:cNvPicPr>
+                  </pic:nvPicPr>
+                  <pic:blipFill>
+                    <a:blip r:embed="rId6"/>
+                    <a:stretch>
+                      <a:fillRect/>
+                    </a:stretch>
+                  </pic:blipFill>
+                  <pic:spPr>
+                    <a:xfrm>
+                      <a:off x="0" y="0"/>
+                      <a:ext cx="5393055" cy="2877185"/>
+                    </a:xfrm>
+                    <a:prstGeom prst="rect">
+                      <a:avLst/>
+                    </a:prstGeom>
+                  </pic:spPr>
+                </pic:pic>
+              </a:graphicData>
+            </a:graphic>
+          </wp:inline>
+        </w:drawing>
       </w:r>
     </w:p>
     <w:p>
@@ -13895,13 +13911,6 @@
           <w:lang w:val="pt-BR" w:eastAsia="en-US"/>
         </w:rPr>
       </w:pPr>
-      <w:r>
-        <w:rPr>
-          <w:rFonts w:hint="default" w:ascii="Calibri" w:hAnsi="Calibri" w:cs="Calibri"/>
-          <w:lang w:val="pt-BR" w:eastAsia="en-US"/>
-        </w:rPr>
-        <w:t>Sub-diagrama EAP 1</w:t>
-      </w:r>
     </w:p>
     <w:p>
       <w:pPr>
@@ -13915,6 +13924,53 @@
           <w:lang w:val="pt-BR" w:eastAsia="en-US" w:bidi="ar-SA"/>
         </w:rPr>
       </w:pPr>
+      <w:r>
+        <w:rPr>
+          <w:rFonts w:hint="default" w:ascii="Calibri" w:hAnsi="Calibri" w:eastAsia="SimSun" w:cs="Calibri"/>
+          <w:b/>
+          <w:bCs/>
+          <w:sz w:val="22"/>
+          <w:szCs w:val="22"/>
+          <w:lang w:val="pt-BR" w:eastAsia="en-US" w:bidi="ar-SA"/>
+        </w:rPr>
+        <w:drawing>
+          <wp:inline distT="0" distB="0" distL="114300" distR="114300">
+            <wp:extent cx="5393055" cy="4848225"/>
+            <wp:effectExtent l="0" t="0" r="17145" b="9525"/>
+            <wp:docPr id="3" name="Picture 3" descr="EAP_COGME_v3.0_MF1_Fundacao.drawio"/>
+            <wp:cNvGraphicFramePr>
+              <a:graphicFrameLocks xmlns:a="http://schemas.openxmlformats.org/drawingml/2006/main" noChangeAspect="1"/>
+            </wp:cNvGraphicFramePr>
+            <a:graphic xmlns:a="http://schemas.openxmlformats.org/drawingml/2006/main">
+              <a:graphicData uri="http://schemas.openxmlformats.org/drawingml/2006/picture">
+                <pic:pic xmlns:pic="http://schemas.openxmlformats.org/drawingml/2006/picture">
+                  <pic:nvPicPr>
+                    <pic:cNvPr id="3" name="Picture 3" descr="EAP_COGME_v3.0_MF1_Fundacao.drawio"/>
+                    <pic:cNvPicPr>
+                      <a:picLocks noChangeAspect="1"/>
+                    </pic:cNvPicPr>
+                  </pic:nvPicPr>
+                  <pic:blipFill>
+                    <a:blip r:embed="rId7"/>
+                    <a:stretch>
+                      <a:fillRect/>
+                    </a:stretch>
+                  </pic:blipFill>
+                  <pic:spPr>
+                    <a:xfrm>
+                      <a:off x="0" y="0"/>
+                      <a:ext cx="5393055" cy="4848225"/>
+                    </a:xfrm>
+                    <a:prstGeom prst="rect">
+                      <a:avLst/>
+                    </a:prstGeom>
+                  </pic:spPr>
+                </pic:pic>
+              </a:graphicData>
+            </a:graphic>
+          </wp:inline>
+        </w:drawing>
+      </w:r>
     </w:p>
     <w:p>
       <w:pPr>
@@ -13942,10 +13998,10 @@
       </w:pPr>
       <w:r>
         <w:rPr>
-          <w:rFonts w:hint="default" w:ascii="Calibri" w:hAnsi="Calibri" w:eastAsia="Times New Roman" w:cs="Calibri"/>
+          <w:rFonts w:hint="default" w:ascii="Calibri" w:hAnsi="Calibri" w:cs="Calibri"/>
           <w:lang w:val="pt-BR" w:eastAsia="en-US"/>
         </w:rPr>
-        <w:t>Sub-diagrama EAP 2</w:t>
+        <w:t xml:space="preserve"> </w:t>
       </w:r>
     </w:p>
     <w:p>
@@ -13960,6 +14016,53 @@
           <w:lang w:val="pt-BR" w:eastAsia="en-US" w:bidi="ar-SA"/>
         </w:rPr>
       </w:pPr>
+      <w:r>
+        <w:rPr>
+          <w:rFonts w:hint="default" w:ascii="Calibri" w:hAnsi="Calibri" w:eastAsia="SimSun" w:cs="Calibri"/>
+          <w:b/>
+          <w:bCs/>
+          <w:sz w:val="22"/>
+          <w:szCs w:val="22"/>
+          <w:lang w:val="pt-BR" w:eastAsia="en-US" w:bidi="ar-SA"/>
+        </w:rPr>
+        <w:drawing>
+          <wp:inline distT="0" distB="0" distL="114300" distR="114300">
+            <wp:extent cx="5398135" cy="4963160"/>
+            <wp:effectExtent l="0" t="0" r="12065" b="8890"/>
+            <wp:docPr id="4" name="Picture 4" descr="EAP_COGME_v3.0_MF2_Construcao.drawio"/>
+            <wp:cNvGraphicFramePr>
+              <a:graphicFrameLocks xmlns:a="http://schemas.openxmlformats.org/drawingml/2006/main" noChangeAspect="1"/>
+            </wp:cNvGraphicFramePr>
+            <a:graphic xmlns:a="http://schemas.openxmlformats.org/drawingml/2006/main">
+              <a:graphicData uri="http://schemas.openxmlformats.org/drawingml/2006/picture">
+                <pic:pic xmlns:pic="http://schemas.openxmlformats.org/drawingml/2006/picture">
+                  <pic:nvPicPr>
+                    <pic:cNvPr id="4" name="Picture 4" descr="EAP_COGME_v3.0_MF2_Construcao.drawio"/>
+                    <pic:cNvPicPr>
+                      <a:picLocks noChangeAspect="1"/>
+                    </pic:cNvPicPr>
+                  </pic:nvPicPr>
+                  <pic:blipFill>
+                    <a:blip r:embed="rId8"/>
+                    <a:stretch>
+                      <a:fillRect/>
+                    </a:stretch>
+                  </pic:blipFill>
+                  <pic:spPr>
+                    <a:xfrm>
+                      <a:off x="0" y="0"/>
+                      <a:ext cx="5398135" cy="4963160"/>
+                    </a:xfrm>
+                    <a:prstGeom prst="rect">
+                      <a:avLst/>
+                    </a:prstGeom>
+                  </pic:spPr>
+                </pic:pic>
+              </a:graphicData>
+            </a:graphic>
+          </wp:inline>
+        </w:drawing>
+      </w:r>
     </w:p>
     <w:p>
       <w:pPr>
@@ -13987,10 +14090,10 @@
       </w:pPr>
       <w:r>
         <w:rPr>
-          <w:rFonts w:hint="default" w:ascii="Calibri" w:hAnsi="Calibri" w:eastAsia="Times New Roman" w:cs="Calibri"/>
+          <w:rFonts w:hint="default" w:ascii="Calibri" w:hAnsi="Calibri" w:cs="Calibri"/>
           <w:lang w:val="pt-BR" w:eastAsia="en-US"/>
         </w:rPr>
-        <w:t>Sub-diagrama EAP 3</w:t>
+        <w:t xml:space="preserve"> </w:t>
       </w:r>
     </w:p>
     <w:p>
@@ -14005,6 +14108,55 @@
           <w:lang w:val="pt-BR" w:eastAsia="en-US" w:bidi="ar-SA"/>
         </w:rPr>
       </w:pPr>
+      <w:bookmarkStart w:id="14" w:name="_GoBack"/>
+      <w:r>
+        <w:rPr>
+          <w:rFonts w:hint="default" w:ascii="Calibri" w:hAnsi="Calibri" w:eastAsia="SimSun" w:cs="Calibri"/>
+          <w:b/>
+          <w:bCs/>
+          <w:sz w:val="22"/>
+          <w:szCs w:val="22"/>
+          <w:lang w:val="pt-BR" w:eastAsia="en-US" w:bidi="ar-SA"/>
+        </w:rPr>
+        <w:drawing>
+          <wp:inline distT="0" distB="0" distL="114300" distR="114300">
+            <wp:extent cx="5394960" cy="4123690"/>
+            <wp:effectExtent l="0" t="0" r="15240" b="10160"/>
+            <wp:docPr id="5" name="Picture 5" descr="EAP_COGME_v3.0_MF3_Consolidacao.drawio"/>
+            <wp:cNvGraphicFramePr>
+              <a:graphicFrameLocks xmlns:a="http://schemas.openxmlformats.org/drawingml/2006/main" noChangeAspect="1"/>
+            </wp:cNvGraphicFramePr>
+            <a:graphic xmlns:a="http://schemas.openxmlformats.org/drawingml/2006/main">
+              <a:graphicData uri="http://schemas.openxmlformats.org/drawingml/2006/picture">
+                <pic:pic xmlns:pic="http://schemas.openxmlformats.org/drawingml/2006/picture">
+                  <pic:nvPicPr>
+                    <pic:cNvPr id="5" name="Picture 5" descr="EAP_COGME_v3.0_MF3_Consolidacao.drawio"/>
+                    <pic:cNvPicPr>
+                      <a:picLocks noChangeAspect="1"/>
+                    </pic:cNvPicPr>
+                  </pic:nvPicPr>
+                  <pic:blipFill>
+                    <a:blip r:embed="rId9"/>
+                    <a:stretch>
+                      <a:fillRect/>
+                    </a:stretch>
+                  </pic:blipFill>
+                  <pic:spPr>
+                    <a:xfrm>
+                      <a:off x="0" y="0"/>
+                      <a:ext cx="5394960" cy="4123690"/>
+                    </a:xfrm>
+                    <a:prstGeom prst="rect">
+                      <a:avLst/>
+                    </a:prstGeom>
+                  </pic:spPr>
+                </pic:pic>
+              </a:graphicData>
+            </a:graphic>
+          </wp:inline>
+        </w:drawing>
+      </w:r>
+      <w:bookmarkEnd w:id="14"/>
     </w:p>
     <w:p>
       <w:pPr>
@@ -27929,6 +28081,12 @@
             <w:insideH w:val="none" w:color="auto" w:sz="0" w:space="0"/>
             <w:insideV w:val="none" w:color="auto" w:sz="0" w:space="0"/>
           </w:tblBorders>
+          <w:tblCellMar>
+            <w:top w:w="80" w:type="dxa"/>
+            <w:left w:w="160" w:type="dxa"/>
+            <w:bottom w:w="80" w:type="dxa"/>
+            <w:right w:w="160" w:type="dxa"/>
+          </w:tblCellMar>
         </w:tblPrEx>
         <w:trPr>
           <w:tblCellSpacing w:w="0" w:type="dxa"/>
@@ -28469,6 +28627,12 @@
             <w:insideH w:val="none" w:color="auto" w:sz="0" w:space="0"/>
             <w:insideV w:val="none" w:color="auto" w:sz="0" w:space="0"/>
           </w:tblBorders>
+          <w:tblCellMar>
+            <w:top w:w="80" w:type="dxa"/>
+            <w:left w:w="160" w:type="dxa"/>
+            <w:bottom w:w="80" w:type="dxa"/>
+            <w:right w:w="160" w:type="dxa"/>
+          </w:tblCellMar>
         </w:tblPrEx>
         <w:trPr>
           <w:tblCellSpacing w:w="0" w:type="dxa"/>
@@ -30208,6 +30372,12 @@
             <w:insideH w:val="none" w:color="auto" w:sz="0" w:space="0"/>
             <w:insideV w:val="none" w:color="auto" w:sz="0" w:space="0"/>
           </w:tblBorders>
+          <w:tblCellMar>
+            <w:top w:w="80" w:type="dxa"/>
+            <w:left w:w="160" w:type="dxa"/>
+            <w:bottom w:w="80" w:type="dxa"/>
+            <w:right w:w="160" w:type="dxa"/>
+          </w:tblCellMar>
         </w:tblPrEx>
         <w:trPr>
           <w:tblCellSpacing w:w="0" w:type="dxa"/>

</xml_diff>